<commit_message>
changes to the tool description for better performance
</commit_message>
<xml_diff>
--- a/project details/research_paper.docx
+++ b/project details/research_paper.docx
@@ -2,6 +2,21 @@
 <file path=word/document.xml><?xml version="1.0" encoding="utf-8"?>
 <w:document xmlns:wpc="http://schemas.microsoft.com/office/word/2010/wordprocessingCanvas" xmlns:cx="http://schemas.microsoft.com/office/drawing/2014/chartex" xmlns:cx1="http://schemas.microsoft.com/office/drawing/2015/9/8/chartex" xmlns:cx2="http://schemas.microsoft.com/office/drawing/2015/10/21/chartex" xmlns:cx3="http://schemas.microsoft.com/office/drawing/2016/5/9/chartex" xmlns:cx4="http://schemas.microsoft.com/office/drawing/2016/5/10/chartex" xmlns:cx5="http://schemas.microsoft.com/office/drawing/2016/5/11/chartex" xmlns:cx6="http://schemas.microsoft.com/office/drawing/2016/5/12/chartex" xmlns:cx7="http://schemas.microsoft.com/office/drawing/2016/5/13/chartex" xmlns:cx8="http://schemas.microsoft.com/office/drawing/2016/5/14/chartex" xmlns:mc="http://schemas.openxmlformats.org/markup-compatibility/2006" xmlns:aink="http://schemas.microsoft.com/office/drawing/2016/ink" xmlns:am3d="http://schemas.microsoft.com/office/drawing/2017/model3d" xmlns:o="urn:schemas-microsoft-com:office:office" xmlns:oel="http://schemas.microsoft.com/office/2019/extlst" xmlns:r="http://schemas.openxmlformats.org/officeDocument/2006/relationships" xmlns:m="http://schemas.openxmlformats.org/officeDocument/2006/math" xmlns:v="urn:schemas-microsoft-com:vml" xmlns:wp14="http://schemas.microsoft.com/office/word/2010/wordprocessingDrawing" xmlns:wp="http://schemas.openxmlformats.org/drawingml/2006/wordprocessingDrawing" xmlns:w10="urn:schemas-microsoft-com:office:word" xmlns:w="http://schemas.openxmlformats.org/wordprocessingml/2006/main" xmlns:w14="http://schemas.microsoft.com/office/word/2010/wordml" xmlns:w15="http://schemas.microsoft.com/office/word/2012/wordml" xmlns:w16cex="http://schemas.microsoft.com/office/word/2018/wordml/cex" xmlns:w16cid="http://schemas.microsoft.com/office/word/2016/wordml/cid" xmlns:w16="http://schemas.microsoft.com/office/word/2018/wordml" xmlns:w16du="http://schemas.microsoft.com/office/word/2023/wordml/word16du" xmlns:w16sdtdh="http://schemas.microsoft.com/office/word/2020/wordml/sdtdatahash" xmlns:w16sdtfl="http://schemas.microsoft.com/office/word/2024/wordml/sdtformatlock" xmlns:w16se="http://schemas.microsoft.com/office/word/2015/wordml/symex" xmlns:wpg="http://schemas.microsoft.com/office/word/2010/wordprocessingGroup" xmlns:wpi="http://schemas.microsoft.com/office/word/2010/wordprocessingInk" xmlns:wne="http://schemas.microsoft.com/office/word/2006/wordml" xmlns:wps="http://schemas.microsoft.com/office/word/2010/wordprocessingShape" mc:Ignorable="w14 w15 w16se w16cid w16 w16cex w16sdtdh w16sdtfl w16du wp14">
   <w:body>
+    <w:p>
+      <w:pPr>
+        <w:rPr>
+          <w:b/>
+          <w:bCs/>
+        </w:rPr>
+      </w:pPr>
+      <w:r>
+        <w:rPr>
+          <w:b/>
+          <w:bCs/>
+        </w:rPr>
+        <w:t>Llms latency</w:t>
+      </w:r>
+    </w:p>
     <w:p>
       <w:r>
         <w:t>Most games need to run at around 30 FPS, which means a real-time AI agent would need to act 30 times per second, not currently feasible with today’s agentic LLMs.</w:t>
@@ -91,15 +106,7 @@
         <w:t>Persistence</w:t>
       </w:r>
       <w:r>
-        <w:t xml:space="preserve">: Remembering past interactions to inform future </w:t>
-      </w:r>
-      <w:proofErr w:type="spellStart"/>
-      <w:r>
-        <w:t>behavior</w:t>
-      </w:r>
-      <w:proofErr w:type="spellEnd"/>
-      <w:r>
-        <w:t>.</w:t>
+        <w:t>: Remembering past interactions to inform future behavior.</w:t>
       </w:r>
     </w:p>
     <w:p/>
@@ -113,15 +120,256 @@
         </w:r>
       </w:hyperlink>
     </w:p>
+    <w:p>
+      <w:r>
+        <w:t>Current LLMs have bounded numerical precision, slow inference latency (prohibitive for real-time games without batching or on-device deployment), and limited visual perceptual capability (necessitating pre-processing for non-text games) (</w:t>
+      </w:r>
+      <w:hyperlink r:id="rId6" w:history="1">
+        <w:r>
+          <w:rPr>
+            <w:rStyle w:val="Hyperlink"/>
+          </w:rPr>
+          <w:t>Li, 30 Aug 2025</w:t>
+        </w:r>
+      </w:hyperlink>
+      <w:r>
+        <w:t>, </w:t>
+      </w:r>
+      <w:hyperlink r:id="rId7" w:history="1">
+        <w:r>
+          <w:rPr>
+            <w:rStyle w:val="Hyperlink"/>
+          </w:rPr>
+          <w:t>Zhao et al., 13 Jul 2025</w:t>
+        </w:r>
+      </w:hyperlink>
+      <w:r>
+        <w:t>).</w:t>
+      </w:r>
+    </w:p>
+    <w:p>
+      <w:pPr>
+        <w:rPr>
+          <w:b/>
+          <w:bCs/>
+        </w:rPr>
+      </w:pPr>
+      <w:r>
+        <w:rPr>
+          <w:b/>
+          <w:bCs/>
+        </w:rPr>
+        <w:t>Non determinsistic nature</w:t>
+      </w:r>
+    </w:p>
+    <w:p>
+      <w:pPr>
+        <w:numPr>
+          <w:ilvl w:val="0"/>
+          <w:numId w:val="3"/>
+        </w:numPr>
+      </w:pPr>
+      <w:r>
+        <w:t>LLM responses can exhibit stochasticity and non-reproducibility; temperature control and deterministic prompting partially mitigate this (</w:t>
+      </w:r>
+      <w:hyperlink r:id="rId8" w:history="1">
+        <w:r>
+          <w:rPr>
+            <w:rStyle w:val="Hyperlink"/>
+          </w:rPr>
+          <w:t>Wang et al., 26 Sep 2025</w:t>
+        </w:r>
+      </w:hyperlink>
+      <w:r>
+        <w:t>).</w:t>
+      </w:r>
+    </w:p>
+    <w:p>
+      <w:pPr>
+        <w:numPr>
+          <w:ilvl w:val="0"/>
+          <w:numId w:val="3"/>
+        </w:numPr>
+      </w:pPr>
+      <w:hyperlink r:id="rId9" w:history="1">
+        <w:r>
+          <w:rPr>
+            <w:rStyle w:val="Hyperlink"/>
+          </w:rPr>
+          <w:t>arxiv.org/pdf/2509.22170</w:t>
+        </w:r>
+      </w:hyperlink>
+    </w:p>
+    <w:p>
+      <w:pPr>
+        <w:rPr>
+          <w:b/>
+          <w:bCs/>
+        </w:rPr>
+      </w:pPr>
+      <w:r>
+        <w:rPr>
+          <w:b/>
+          <w:bCs/>
+        </w:rPr>
+        <w:t>text based limitation of llms</w:t>
+      </w:r>
+    </w:p>
+    <w:p>
+      <w:pPr>
+        <w:numPr>
+          <w:ilvl w:val="0"/>
+          <w:numId w:val="3"/>
+        </w:numPr>
+        <w:pBdr>
+          <w:top w:val="single" w:sz="2" w:space="0" w:color="auto"/>
+          <w:left w:val="single" w:sz="2" w:space="9" w:color="auto"/>
+          <w:bottom w:val="single" w:sz="2" w:space="0" w:color="auto"/>
+          <w:right w:val="single" w:sz="2" w:space="0" w:color="auto"/>
+        </w:pBdr>
+        <w:shd w:val="clear" w:color="auto" w:fill="FFFFFF"/>
+        <w:spacing w:after="0" w:line="240" w:lineRule="auto"/>
+        <w:rPr>
+          <w:rFonts w:ascii="Cambria" w:hAnsi="Cambria"/>
+          <w:color w:val="302A21"/>
+          <w:sz w:val="27"/>
+          <w:szCs w:val="27"/>
+        </w:rPr>
+      </w:pPr>
+      <w:r>
+        <w:rPr>
+          <w:rFonts w:ascii="Cambria" w:hAnsi="Cambria"/>
+          <w:color w:val="302A21"/>
+          <w:sz w:val="27"/>
+          <w:szCs w:val="27"/>
+        </w:rPr>
+        <w:t>Purely text-based LLM agents cannot handle graphically rich or highly visual games natively; multimodal model integration, e.g., vision-to-matrix translation via learned detectors, is required to generalize (</w:t>
+      </w:r>
+      <w:hyperlink r:id="rId10" w:history="1">
+        <w:r>
+          <w:rPr>
+            <w:rStyle w:val="Hyperlink"/>
+            <w:rFonts w:ascii="Cambria" w:hAnsi="Cambria"/>
+            <w:sz w:val="27"/>
+            <w:szCs w:val="27"/>
+            <w:bdr w:val="single" w:sz="2" w:space="0" w:color="CCCCFF" w:frame="1"/>
+          </w:rPr>
+          <w:t>Zhao et al., 13 Jul 2025</w:t>
+        </w:r>
+      </w:hyperlink>
+      <w:r>
+        <w:rPr>
+          <w:rFonts w:ascii="Cambria" w:hAnsi="Cambria"/>
+          <w:color w:val="302A21"/>
+          <w:sz w:val="27"/>
+          <w:szCs w:val="27"/>
+        </w:rPr>
+        <w:t>).</w:t>
+      </w:r>
+    </w:p>
     <w:p/>
-    <w:p>
-      <w:proofErr w:type="spellStart"/>
-      <w:r>
-        <w:t>Experimetns</w:t>
-      </w:r>
-      <w:proofErr w:type="spellEnd"/>
+    <w:p/>
+    <w:p/>
+    <w:p>
+      <w:pPr>
+        <w:rPr>
+          <w:b/>
+          <w:bCs/>
+        </w:rPr>
+      </w:pPr>
+      <w:r>
+        <w:rPr>
+          <w:b/>
+          <w:bCs/>
+        </w:rPr>
+        <w:t>About React framework</w:t>
+      </w:r>
+    </w:p>
+    <w:p>
+      <w:r>
+        <w:t>In this setup, the LLM agent observes its environment through text-based inputs and takes action using tools, like performing a web search. But how does it decide which action to take? This brings us to a crucial component of any LLM agent: planning. To plan effectively, the LLM needs to "reason" or "think" through a problem, often using techniques like Chain of Thought.</w:t>
+      </w:r>
+    </w:p>
+    <w:p>
+      <w:r>
+        <w:t>By leveraging this reasoning ability, the LLM agent can map out the sequence of actions required to complete a task.</w:t>
+      </w:r>
+    </w:p>
+    <w:p>
+      <w:r>
+        <w:t>This entire process forms a loop: the agent perceives the situation (LLM), plans its next moves (Planning), executes them (Tools), and remembers the outcomes (Memory).</w:t>
+      </w:r>
+    </w:p>
+    <w:p>
+      <w:r>
+        <w:lastRenderedPageBreak/>
+        <w:t>Different systems can grant LLM agents varying degrees of freedom. Generally, the more "agentic" a system is, the more autonomy the LLM has in deciding its own behavior.</w:t>
+      </w:r>
+    </w:p>
+    <w:p>
+      <w:hyperlink r:id="rId11" w:history="1">
+        <w:r>
+          <w:rPr>
+            <w:rStyle w:val="Hyperlink"/>
+          </w:rPr>
+          <w:t>LLM Agents Explained: Architecture, Tools, Memory &amp; Multi-Agent Systems (2026) | LLM Practical Experience Hub</w:t>
+        </w:r>
+      </w:hyperlink>
+    </w:p>
+    <w:p>
+      <w:r>
+        <w:t>R</w:t>
+      </w:r>
+      <w:r>
+        <w:t>easoning</w:t>
+      </w:r>
       <w:r>
         <w:t xml:space="preserve"> </w:t>
+      </w:r>
+      <w:r>
+        <w:t>traces help the model induce, track, and update action plans as well as handle</w:t>
+      </w:r>
+    </w:p>
+    <w:p>
+      <w:r>
+        <w:t>exceptions, while actions allow it to interface with and gather additional information</w:t>
+      </w:r>
+    </w:p>
+    <w:p>
+      <w:r>
+        <w:t>from external sources such as knowledge bases or environments</w:t>
+      </w:r>
+    </w:p>
+    <w:p>
+      <w:hyperlink r:id="rId12" w:history="1">
+        <w:r>
+          <w:rPr>
+            <w:rStyle w:val="Hyperlink"/>
+          </w:rPr>
+          <w:t>arxiv.org/pdf/2210.03629</w:t>
+        </w:r>
+      </w:hyperlink>
+    </w:p>
+    <w:p>
+      <w:pPr>
+        <w:rPr>
+          <w:b/>
+          <w:bCs/>
+        </w:rPr>
+      </w:pPr>
+      <w:r>
+        <w:rPr>
+          <w:b/>
+          <w:bCs/>
+        </w:rPr>
+        <w:t>Experime</w:t>
+      </w:r>
+      <w:r>
+        <w:rPr>
+          <w:b/>
+          <w:bCs/>
+        </w:rPr>
+        <w:t>nts</w:t>
       </w:r>
     </w:p>
     <w:p>
@@ -133,15 +381,7 @@
         </w:numPr>
       </w:pPr>
       <w:r>
-        <w:t xml:space="preserve">Example.log   with issues in </w:t>
-      </w:r>
-      <w:proofErr w:type="spellStart"/>
-      <w:r>
-        <w:t>astar</w:t>
-      </w:r>
-      <w:proofErr w:type="spellEnd"/>
-      <w:r>
-        <w:t xml:space="preserve"> algo</w:t>
+        <w:t>Example.log   with issues in astar algo</w:t>
       </w:r>
     </w:p>
     <w:p>
@@ -166,6 +406,41 @@
           <w:ilvl w:val="0"/>
           <w:numId w:val="2"/>
         </w:numPr>
+      </w:pPr>
+      <w:r>
+        <w:t>Example_with_</w:t>
+      </w:r>
+      <w:r>
+        <w:t>fixed</w:t>
+      </w:r>
+      <w:r>
+        <w:t xml:space="preserve">_astar.log this one is </w:t>
+      </w:r>
+      <w:r>
+        <w:t>with fixed astar showed better accuracy.</w:t>
+      </w:r>
+    </w:p>
+    <w:p/>
+    <w:p>
+      <w:r>
+        <w:t>Notes:-</w:t>
+      </w:r>
+    </w:p>
+    <w:p/>
+    <w:p>
+      <w:r>
+        <w:t>If the model finished the task successfully and with less step it means it does not follow the rules.</w:t>
+      </w:r>
+      <w:r>
+        <w:t xml:space="preserve"> Like step of 25 px.</w:t>
+      </w:r>
+    </w:p>
+    <w:p/>
+    <w:p/>
+    <w:p/>
+    <w:p>
+      <w:pPr>
+        <w:pStyle w:val="ListParagraph"/>
       </w:pPr>
     </w:p>
     <w:sectPr>
@@ -181,6 +456,155 @@
 <file path=word/numbering.xml><?xml version="1.0" encoding="utf-8"?>
 <w:numbering xmlns:wpc="http://schemas.microsoft.com/office/word/2010/wordprocessingCanvas" xmlns:cx="http://schemas.microsoft.com/office/drawing/2014/chartex" xmlns:cx1="http://schemas.microsoft.com/office/drawing/2015/9/8/chartex" xmlns:cx2="http://schemas.microsoft.com/office/drawing/2015/10/21/chartex" xmlns:cx3="http://schemas.microsoft.com/office/drawing/2016/5/9/chartex" xmlns:cx4="http://schemas.microsoft.com/office/drawing/2016/5/10/chartex" xmlns:cx5="http://schemas.microsoft.com/office/drawing/2016/5/11/chartex" xmlns:cx6="http://schemas.microsoft.com/office/drawing/2016/5/12/chartex" xmlns:cx7="http://schemas.microsoft.com/office/drawing/2016/5/13/chartex" xmlns:cx8="http://schemas.microsoft.com/office/drawing/2016/5/14/chartex" xmlns:mc="http://schemas.openxmlformats.org/markup-compatibility/2006" xmlns:aink="http://schemas.microsoft.com/office/drawing/2016/ink" xmlns:am3d="http://schemas.microsoft.com/office/drawing/2017/model3d" xmlns:o="urn:schemas-microsoft-com:office:office" xmlns:oel="http://schemas.microsoft.com/office/2019/extlst" xmlns:r="http://schemas.openxmlformats.org/officeDocument/2006/relationships" xmlns:m="http://schemas.openxmlformats.org/officeDocument/2006/math" xmlns:v="urn:schemas-microsoft-com:vml" xmlns:wp14="http://schemas.microsoft.com/office/word/2010/wordprocessingDrawing" xmlns:wp="http://schemas.openxmlformats.org/drawingml/2006/wordprocessingDrawing" xmlns:w10="urn:schemas-microsoft-com:office:word" xmlns:w="http://schemas.openxmlformats.org/wordprocessingml/2006/main" xmlns:w14="http://schemas.microsoft.com/office/word/2010/wordml" xmlns:w15="http://schemas.microsoft.com/office/word/2012/wordml" xmlns:w16cex="http://schemas.microsoft.com/office/word/2018/wordml/cex" xmlns:w16cid="http://schemas.microsoft.com/office/word/2016/wordml/cid" xmlns:w16="http://schemas.microsoft.com/office/word/2018/wordml" xmlns:w16du="http://schemas.microsoft.com/office/word/2023/wordml/word16du" xmlns:w16sdtdh="http://schemas.microsoft.com/office/word/2020/wordml/sdtdatahash" xmlns:w16sdtfl="http://schemas.microsoft.com/office/word/2024/wordml/sdtformatlock" xmlns:w16se="http://schemas.microsoft.com/office/word/2015/wordml/symex" xmlns:wpg="http://schemas.microsoft.com/office/word/2010/wordprocessingGroup" xmlns:wpi="http://schemas.microsoft.com/office/word/2010/wordprocessingInk" xmlns:wne="http://schemas.microsoft.com/office/word/2006/wordml" xmlns:wps="http://schemas.microsoft.com/office/word/2010/wordprocessingShape" mc:Ignorable="w14 w15 w16se w16cid w16 w16cex w16sdtdh w16sdtfl w16du wp14">
   <w:abstractNum w:abstractNumId="0" w15:restartNumberingAfterBreak="0">
+    <w:nsid w:val="10705747"/>
+    <w:multiLevelType w:val="multilevel"/>
+    <w:tmpl w:val="27543388"/>
+    <w:lvl w:ilvl="0">
+      <w:start w:val="1"/>
+      <w:numFmt w:val="bullet"/>
+      <w:lvlText w:val=""/>
+      <w:lvlJc w:val="left"/>
+      <w:pPr>
+        <w:tabs>
+          <w:tab w:val="num" w:pos="720"/>
+        </w:tabs>
+        <w:ind w:left="720" w:hanging="360"/>
+      </w:pPr>
+      <w:rPr>
+        <w:rFonts w:ascii="Symbol" w:hAnsi="Symbol" w:hint="default"/>
+        <w:sz w:val="20"/>
+      </w:rPr>
+    </w:lvl>
+    <w:lvl w:ilvl="1" w:tentative="1">
+      <w:start w:val="1"/>
+      <w:numFmt w:val="bullet"/>
+      <w:lvlText w:val="o"/>
+      <w:lvlJc w:val="left"/>
+      <w:pPr>
+        <w:tabs>
+          <w:tab w:val="num" w:pos="1440"/>
+        </w:tabs>
+        <w:ind w:left="1440" w:hanging="360"/>
+      </w:pPr>
+      <w:rPr>
+        <w:rFonts w:ascii="Courier New" w:hAnsi="Courier New" w:hint="default"/>
+        <w:sz w:val="20"/>
+      </w:rPr>
+    </w:lvl>
+    <w:lvl w:ilvl="2" w:tentative="1">
+      <w:start w:val="1"/>
+      <w:numFmt w:val="bullet"/>
+      <w:lvlText w:val=""/>
+      <w:lvlJc w:val="left"/>
+      <w:pPr>
+        <w:tabs>
+          <w:tab w:val="num" w:pos="2160"/>
+        </w:tabs>
+        <w:ind w:left="2160" w:hanging="360"/>
+      </w:pPr>
+      <w:rPr>
+        <w:rFonts w:ascii="Wingdings" w:hAnsi="Wingdings" w:hint="default"/>
+        <w:sz w:val="20"/>
+      </w:rPr>
+    </w:lvl>
+    <w:lvl w:ilvl="3" w:tentative="1">
+      <w:start w:val="1"/>
+      <w:numFmt w:val="bullet"/>
+      <w:lvlText w:val=""/>
+      <w:lvlJc w:val="left"/>
+      <w:pPr>
+        <w:tabs>
+          <w:tab w:val="num" w:pos="2880"/>
+        </w:tabs>
+        <w:ind w:left="2880" w:hanging="360"/>
+      </w:pPr>
+      <w:rPr>
+        <w:rFonts w:ascii="Wingdings" w:hAnsi="Wingdings" w:hint="default"/>
+        <w:sz w:val="20"/>
+      </w:rPr>
+    </w:lvl>
+    <w:lvl w:ilvl="4" w:tentative="1">
+      <w:start w:val="1"/>
+      <w:numFmt w:val="bullet"/>
+      <w:lvlText w:val=""/>
+      <w:lvlJc w:val="left"/>
+      <w:pPr>
+        <w:tabs>
+          <w:tab w:val="num" w:pos="3600"/>
+        </w:tabs>
+        <w:ind w:left="3600" w:hanging="360"/>
+      </w:pPr>
+      <w:rPr>
+        <w:rFonts w:ascii="Wingdings" w:hAnsi="Wingdings" w:hint="default"/>
+        <w:sz w:val="20"/>
+      </w:rPr>
+    </w:lvl>
+    <w:lvl w:ilvl="5" w:tentative="1">
+      <w:start w:val="1"/>
+      <w:numFmt w:val="bullet"/>
+      <w:lvlText w:val=""/>
+      <w:lvlJc w:val="left"/>
+      <w:pPr>
+        <w:tabs>
+          <w:tab w:val="num" w:pos="4320"/>
+        </w:tabs>
+        <w:ind w:left="4320" w:hanging="360"/>
+      </w:pPr>
+      <w:rPr>
+        <w:rFonts w:ascii="Wingdings" w:hAnsi="Wingdings" w:hint="default"/>
+        <w:sz w:val="20"/>
+      </w:rPr>
+    </w:lvl>
+    <w:lvl w:ilvl="6" w:tentative="1">
+      <w:start w:val="1"/>
+      <w:numFmt w:val="bullet"/>
+      <w:lvlText w:val=""/>
+      <w:lvlJc w:val="left"/>
+      <w:pPr>
+        <w:tabs>
+          <w:tab w:val="num" w:pos="5040"/>
+        </w:tabs>
+        <w:ind w:left="5040" w:hanging="360"/>
+      </w:pPr>
+      <w:rPr>
+        <w:rFonts w:ascii="Wingdings" w:hAnsi="Wingdings" w:hint="default"/>
+        <w:sz w:val="20"/>
+      </w:rPr>
+    </w:lvl>
+    <w:lvl w:ilvl="7" w:tentative="1">
+      <w:start w:val="1"/>
+      <w:numFmt w:val="bullet"/>
+      <w:lvlText w:val=""/>
+      <w:lvlJc w:val="left"/>
+      <w:pPr>
+        <w:tabs>
+          <w:tab w:val="num" w:pos="5760"/>
+        </w:tabs>
+        <w:ind w:left="5760" w:hanging="360"/>
+      </w:pPr>
+      <w:rPr>
+        <w:rFonts w:ascii="Wingdings" w:hAnsi="Wingdings" w:hint="default"/>
+        <w:sz w:val="20"/>
+      </w:rPr>
+    </w:lvl>
+    <w:lvl w:ilvl="8" w:tentative="1">
+      <w:start w:val="1"/>
+      <w:numFmt w:val="bullet"/>
+      <w:lvlText w:val=""/>
+      <w:lvlJc w:val="left"/>
+      <w:pPr>
+        <w:tabs>
+          <w:tab w:val="num" w:pos="6480"/>
+        </w:tabs>
+        <w:ind w:left="6480" w:hanging="360"/>
+      </w:pPr>
+      <w:rPr>
+        <w:rFonts w:ascii="Wingdings" w:hAnsi="Wingdings" w:hint="default"/>
+        <w:sz w:val="20"/>
+      </w:rPr>
+    </w:lvl>
+  </w:abstractNum>
+  <w:abstractNum w:abstractNumId="1" w15:restartNumberingAfterBreak="0">
     <w:nsid w:val="1C7F5896"/>
     <w:multiLevelType w:val="hybridMultilevel"/>
     <w:tmpl w:val="2F1CC104"/>
@@ -269,7 +693,305 @@
       </w:pPr>
     </w:lvl>
   </w:abstractNum>
-  <w:abstractNum w:abstractNumId="1" w15:restartNumberingAfterBreak="0">
+  <w:abstractNum w:abstractNumId="2" w15:restartNumberingAfterBreak="0">
+    <w:nsid w:val="5BBF7B11"/>
+    <w:multiLevelType w:val="multilevel"/>
+    <w:tmpl w:val="0B841FE0"/>
+    <w:lvl w:ilvl="0">
+      <w:start w:val="1"/>
+      <w:numFmt w:val="bullet"/>
+      <w:lvlText w:val=""/>
+      <w:lvlJc w:val="left"/>
+      <w:pPr>
+        <w:tabs>
+          <w:tab w:val="num" w:pos="720"/>
+        </w:tabs>
+        <w:ind w:left="720" w:hanging="360"/>
+      </w:pPr>
+      <w:rPr>
+        <w:rFonts w:ascii="Symbol" w:hAnsi="Symbol" w:hint="default"/>
+        <w:sz w:val="20"/>
+      </w:rPr>
+    </w:lvl>
+    <w:lvl w:ilvl="1" w:tentative="1">
+      <w:start w:val="1"/>
+      <w:numFmt w:val="bullet"/>
+      <w:lvlText w:val="o"/>
+      <w:lvlJc w:val="left"/>
+      <w:pPr>
+        <w:tabs>
+          <w:tab w:val="num" w:pos="1440"/>
+        </w:tabs>
+        <w:ind w:left="1440" w:hanging="360"/>
+      </w:pPr>
+      <w:rPr>
+        <w:rFonts w:ascii="Courier New" w:hAnsi="Courier New" w:hint="default"/>
+        <w:sz w:val="20"/>
+      </w:rPr>
+    </w:lvl>
+    <w:lvl w:ilvl="2" w:tentative="1">
+      <w:start w:val="1"/>
+      <w:numFmt w:val="bullet"/>
+      <w:lvlText w:val=""/>
+      <w:lvlJc w:val="left"/>
+      <w:pPr>
+        <w:tabs>
+          <w:tab w:val="num" w:pos="2160"/>
+        </w:tabs>
+        <w:ind w:left="2160" w:hanging="360"/>
+      </w:pPr>
+      <w:rPr>
+        <w:rFonts w:ascii="Wingdings" w:hAnsi="Wingdings" w:hint="default"/>
+        <w:sz w:val="20"/>
+      </w:rPr>
+    </w:lvl>
+    <w:lvl w:ilvl="3" w:tentative="1">
+      <w:start w:val="1"/>
+      <w:numFmt w:val="bullet"/>
+      <w:lvlText w:val=""/>
+      <w:lvlJc w:val="left"/>
+      <w:pPr>
+        <w:tabs>
+          <w:tab w:val="num" w:pos="2880"/>
+        </w:tabs>
+        <w:ind w:left="2880" w:hanging="360"/>
+      </w:pPr>
+      <w:rPr>
+        <w:rFonts w:ascii="Wingdings" w:hAnsi="Wingdings" w:hint="default"/>
+        <w:sz w:val="20"/>
+      </w:rPr>
+    </w:lvl>
+    <w:lvl w:ilvl="4" w:tentative="1">
+      <w:start w:val="1"/>
+      <w:numFmt w:val="bullet"/>
+      <w:lvlText w:val=""/>
+      <w:lvlJc w:val="left"/>
+      <w:pPr>
+        <w:tabs>
+          <w:tab w:val="num" w:pos="3600"/>
+        </w:tabs>
+        <w:ind w:left="3600" w:hanging="360"/>
+      </w:pPr>
+      <w:rPr>
+        <w:rFonts w:ascii="Wingdings" w:hAnsi="Wingdings" w:hint="default"/>
+        <w:sz w:val="20"/>
+      </w:rPr>
+    </w:lvl>
+    <w:lvl w:ilvl="5" w:tentative="1">
+      <w:start w:val="1"/>
+      <w:numFmt w:val="bullet"/>
+      <w:lvlText w:val=""/>
+      <w:lvlJc w:val="left"/>
+      <w:pPr>
+        <w:tabs>
+          <w:tab w:val="num" w:pos="4320"/>
+        </w:tabs>
+        <w:ind w:left="4320" w:hanging="360"/>
+      </w:pPr>
+      <w:rPr>
+        <w:rFonts w:ascii="Wingdings" w:hAnsi="Wingdings" w:hint="default"/>
+        <w:sz w:val="20"/>
+      </w:rPr>
+    </w:lvl>
+    <w:lvl w:ilvl="6" w:tentative="1">
+      <w:start w:val="1"/>
+      <w:numFmt w:val="bullet"/>
+      <w:lvlText w:val=""/>
+      <w:lvlJc w:val="left"/>
+      <w:pPr>
+        <w:tabs>
+          <w:tab w:val="num" w:pos="5040"/>
+        </w:tabs>
+        <w:ind w:left="5040" w:hanging="360"/>
+      </w:pPr>
+      <w:rPr>
+        <w:rFonts w:ascii="Wingdings" w:hAnsi="Wingdings" w:hint="default"/>
+        <w:sz w:val="20"/>
+      </w:rPr>
+    </w:lvl>
+    <w:lvl w:ilvl="7" w:tentative="1">
+      <w:start w:val="1"/>
+      <w:numFmt w:val="bullet"/>
+      <w:lvlText w:val=""/>
+      <w:lvlJc w:val="left"/>
+      <w:pPr>
+        <w:tabs>
+          <w:tab w:val="num" w:pos="5760"/>
+        </w:tabs>
+        <w:ind w:left="5760" w:hanging="360"/>
+      </w:pPr>
+      <w:rPr>
+        <w:rFonts w:ascii="Wingdings" w:hAnsi="Wingdings" w:hint="default"/>
+        <w:sz w:val="20"/>
+      </w:rPr>
+    </w:lvl>
+    <w:lvl w:ilvl="8" w:tentative="1">
+      <w:start w:val="1"/>
+      <w:numFmt w:val="bullet"/>
+      <w:lvlText w:val=""/>
+      <w:lvlJc w:val="left"/>
+      <w:pPr>
+        <w:tabs>
+          <w:tab w:val="num" w:pos="6480"/>
+        </w:tabs>
+        <w:ind w:left="6480" w:hanging="360"/>
+      </w:pPr>
+      <w:rPr>
+        <w:rFonts w:ascii="Wingdings" w:hAnsi="Wingdings" w:hint="default"/>
+        <w:sz w:val="20"/>
+      </w:rPr>
+    </w:lvl>
+  </w:abstractNum>
+  <w:abstractNum w:abstractNumId="3" w15:restartNumberingAfterBreak="0">
+    <w:nsid w:val="6A865B7B"/>
+    <w:multiLevelType w:val="multilevel"/>
+    <w:tmpl w:val="7E4A6534"/>
+    <w:lvl w:ilvl="0">
+      <w:start w:val="1"/>
+      <w:numFmt w:val="bullet"/>
+      <w:lvlText w:val=""/>
+      <w:lvlJc w:val="left"/>
+      <w:pPr>
+        <w:tabs>
+          <w:tab w:val="num" w:pos="720"/>
+        </w:tabs>
+        <w:ind w:left="720" w:hanging="360"/>
+      </w:pPr>
+      <w:rPr>
+        <w:rFonts w:ascii="Symbol" w:hAnsi="Symbol" w:hint="default"/>
+        <w:sz w:val="20"/>
+      </w:rPr>
+    </w:lvl>
+    <w:lvl w:ilvl="1" w:tentative="1">
+      <w:start w:val="1"/>
+      <w:numFmt w:val="bullet"/>
+      <w:lvlText w:val="o"/>
+      <w:lvlJc w:val="left"/>
+      <w:pPr>
+        <w:tabs>
+          <w:tab w:val="num" w:pos="1440"/>
+        </w:tabs>
+        <w:ind w:left="1440" w:hanging="360"/>
+      </w:pPr>
+      <w:rPr>
+        <w:rFonts w:ascii="Courier New" w:hAnsi="Courier New" w:hint="default"/>
+        <w:sz w:val="20"/>
+      </w:rPr>
+    </w:lvl>
+    <w:lvl w:ilvl="2" w:tentative="1">
+      <w:start w:val="1"/>
+      <w:numFmt w:val="bullet"/>
+      <w:lvlText w:val=""/>
+      <w:lvlJc w:val="left"/>
+      <w:pPr>
+        <w:tabs>
+          <w:tab w:val="num" w:pos="2160"/>
+        </w:tabs>
+        <w:ind w:left="2160" w:hanging="360"/>
+      </w:pPr>
+      <w:rPr>
+        <w:rFonts w:ascii="Wingdings" w:hAnsi="Wingdings" w:hint="default"/>
+        <w:sz w:val="20"/>
+      </w:rPr>
+    </w:lvl>
+    <w:lvl w:ilvl="3" w:tentative="1">
+      <w:start w:val="1"/>
+      <w:numFmt w:val="bullet"/>
+      <w:lvlText w:val=""/>
+      <w:lvlJc w:val="left"/>
+      <w:pPr>
+        <w:tabs>
+          <w:tab w:val="num" w:pos="2880"/>
+        </w:tabs>
+        <w:ind w:left="2880" w:hanging="360"/>
+      </w:pPr>
+      <w:rPr>
+        <w:rFonts w:ascii="Wingdings" w:hAnsi="Wingdings" w:hint="default"/>
+        <w:sz w:val="20"/>
+      </w:rPr>
+    </w:lvl>
+    <w:lvl w:ilvl="4" w:tentative="1">
+      <w:start w:val="1"/>
+      <w:numFmt w:val="bullet"/>
+      <w:lvlText w:val=""/>
+      <w:lvlJc w:val="left"/>
+      <w:pPr>
+        <w:tabs>
+          <w:tab w:val="num" w:pos="3600"/>
+        </w:tabs>
+        <w:ind w:left="3600" w:hanging="360"/>
+      </w:pPr>
+      <w:rPr>
+        <w:rFonts w:ascii="Wingdings" w:hAnsi="Wingdings" w:hint="default"/>
+        <w:sz w:val="20"/>
+      </w:rPr>
+    </w:lvl>
+    <w:lvl w:ilvl="5" w:tentative="1">
+      <w:start w:val="1"/>
+      <w:numFmt w:val="bullet"/>
+      <w:lvlText w:val=""/>
+      <w:lvlJc w:val="left"/>
+      <w:pPr>
+        <w:tabs>
+          <w:tab w:val="num" w:pos="4320"/>
+        </w:tabs>
+        <w:ind w:left="4320" w:hanging="360"/>
+      </w:pPr>
+      <w:rPr>
+        <w:rFonts w:ascii="Wingdings" w:hAnsi="Wingdings" w:hint="default"/>
+        <w:sz w:val="20"/>
+      </w:rPr>
+    </w:lvl>
+    <w:lvl w:ilvl="6" w:tentative="1">
+      <w:start w:val="1"/>
+      <w:numFmt w:val="bullet"/>
+      <w:lvlText w:val=""/>
+      <w:lvlJc w:val="left"/>
+      <w:pPr>
+        <w:tabs>
+          <w:tab w:val="num" w:pos="5040"/>
+        </w:tabs>
+        <w:ind w:left="5040" w:hanging="360"/>
+      </w:pPr>
+      <w:rPr>
+        <w:rFonts w:ascii="Wingdings" w:hAnsi="Wingdings" w:hint="default"/>
+        <w:sz w:val="20"/>
+      </w:rPr>
+    </w:lvl>
+    <w:lvl w:ilvl="7" w:tentative="1">
+      <w:start w:val="1"/>
+      <w:numFmt w:val="bullet"/>
+      <w:lvlText w:val=""/>
+      <w:lvlJc w:val="left"/>
+      <w:pPr>
+        <w:tabs>
+          <w:tab w:val="num" w:pos="5760"/>
+        </w:tabs>
+        <w:ind w:left="5760" w:hanging="360"/>
+      </w:pPr>
+      <w:rPr>
+        <w:rFonts w:ascii="Wingdings" w:hAnsi="Wingdings" w:hint="default"/>
+        <w:sz w:val="20"/>
+      </w:rPr>
+    </w:lvl>
+    <w:lvl w:ilvl="8" w:tentative="1">
+      <w:start w:val="1"/>
+      <w:numFmt w:val="bullet"/>
+      <w:lvlText w:val=""/>
+      <w:lvlJc w:val="left"/>
+      <w:pPr>
+        <w:tabs>
+          <w:tab w:val="num" w:pos="6480"/>
+        </w:tabs>
+        <w:ind w:left="6480" w:hanging="360"/>
+      </w:pPr>
+      <w:rPr>
+        <w:rFonts w:ascii="Wingdings" w:hAnsi="Wingdings" w:hint="default"/>
+        <w:sz w:val="20"/>
+      </w:rPr>
+    </w:lvl>
+  </w:abstractNum>
+  <w:abstractNum w:abstractNumId="4" w15:restartNumberingAfterBreak="0">
     <w:nsid w:val="6A982140"/>
     <w:multiLevelType w:val="multilevel"/>
     <w:tmpl w:val="7A800132"/>
@@ -419,9 +1141,18 @@
     </w:lvl>
   </w:abstractNum>
   <w:num w:numId="1" w16cid:durableId="486215710">
+    <w:abstractNumId w:val="4"/>
+  </w:num>
+  <w:num w:numId="2" w16cid:durableId="2073892828">
     <w:abstractNumId w:val="1"/>
   </w:num>
-  <w:num w:numId="2" w16cid:durableId="2073892828">
+  <w:num w:numId="3" w16cid:durableId="2008746797">
+    <w:abstractNumId w:val="3"/>
+  </w:num>
+  <w:num w:numId="4" w16cid:durableId="276763547">
+    <w:abstractNumId w:val="2"/>
+  </w:num>
+  <w:num w:numId="5" w16cid:durableId="952439789">
     <w:abstractNumId w:val="0"/>
   </w:num>
 </w:numbering>
@@ -1366,6 +2097,18 @@
       <w:shd w:val="clear" w:color="auto" w:fill="E1DFDD"/>
     </w:rPr>
   </w:style>
+  <w:style w:type="character" w:styleId="FollowedHyperlink">
+    <w:name w:val="FollowedHyperlink"/>
+    <w:basedOn w:val="DefaultParagraphFont"/>
+    <w:uiPriority w:val="99"/>
+    <w:semiHidden/>
+    <w:unhideWhenUsed/>
+    <w:rsid w:val="00212EBF"/>
+    <w:rPr>
+      <w:color w:val="96607D" w:themeColor="followedHyperlink"/>
+      <w:u w:val="single"/>
+    </w:rPr>
+  </w:style>
 </w:styles>
 </file>
 

</xml_diff>

<commit_message>
adding agent messages to log
</commit_message>
<xml_diff>
--- a/project details/research_paper.docx
+++ b/project details/research_paper.docx
@@ -501,6 +501,12 @@
         <w:t xml:space="preserve">For ``` error added </w:t>
       </w:r>
       <w:r>
+        <w:t xml:space="preserve">the following in the </w:t>
+      </w:r>
+      <w:r>
+        <w:t xml:space="preserve">In prompt </w:t>
+      </w:r>
+      <w:r>
         <w:br/>
       </w:r>
       <w:r>
@@ -528,7 +534,13 @@
         <w:ind w:firstLine="360"/>
       </w:pPr>
       <w:r>
-        <w:t>In prompt.And appending state to the message after every tool call.</w:t>
+        <w:t>appending state to the message</w:t>
+      </w:r>
+      <w:r>
+        <w:t>(basically observation)</w:t>
+      </w:r>
+      <w:r>
+        <w:t xml:space="preserve"> after every tool call.</w:t>
       </w:r>
     </w:p>
     <w:p/>

</xml_diff>

<commit_message>
tested langchain react with tools and test new model
</commit_message>
<xml_diff>
--- a/project details/research_paper.docx
+++ b/project details/research_paper.docx
@@ -9,12 +9,21 @@
           <w:bCs/>
         </w:rPr>
       </w:pPr>
-      <w:r>
-        <w:rPr>
-          <w:b/>
-          <w:bCs/>
-        </w:rPr>
-        <w:t>Llms latency</w:t>
+      <w:proofErr w:type="spellStart"/>
+      <w:r>
+        <w:rPr>
+          <w:b/>
+          <w:bCs/>
+        </w:rPr>
+        <w:t>Llms</w:t>
+      </w:r>
+      <w:proofErr w:type="spellEnd"/>
+      <w:r>
+        <w:rPr>
+          <w:b/>
+          <w:bCs/>
+        </w:rPr>
+        <w:t xml:space="preserve"> latency</w:t>
       </w:r>
     </w:p>
     <w:p>
@@ -106,7 +115,15 @@
         <w:t>Persistence</w:t>
       </w:r>
       <w:r>
-        <w:t>: Remembering past interactions to inform future behavior.</w:t>
+        <w:t xml:space="preserve">: Remembering past interactions to inform future </w:t>
+      </w:r>
+      <w:proofErr w:type="spellStart"/>
+      <w:r>
+        <w:t>behavior</w:t>
+      </w:r>
+      <w:proofErr w:type="spellEnd"/>
+      <w:r>
+        <w:t>.</w:t>
       </w:r>
     </w:p>
     <w:p/>
@@ -159,7 +176,23 @@
           <w:b/>
           <w:bCs/>
         </w:rPr>
-        <w:t>Non determinsistic nature</w:t>
+        <w:t xml:space="preserve">Non </w:t>
+      </w:r>
+      <w:proofErr w:type="spellStart"/>
+      <w:r>
+        <w:rPr>
+          <w:b/>
+          <w:bCs/>
+        </w:rPr>
+        <w:t>determinsistic</w:t>
+      </w:r>
+      <w:proofErr w:type="spellEnd"/>
+      <w:r>
+        <w:rPr>
+          <w:b/>
+          <w:bCs/>
+        </w:rPr>
+        <w:t xml:space="preserve"> nature</w:t>
       </w:r>
     </w:p>
     <w:p>
@@ -212,8 +245,17 @@
           <w:b/>
           <w:bCs/>
         </w:rPr>
-        <w:t>text based limitation of llms</w:t>
-      </w:r>
+        <w:t xml:space="preserve">text based limitation of </w:t>
+      </w:r>
+      <w:proofErr w:type="spellStart"/>
+      <w:r>
+        <w:rPr>
+          <w:b/>
+          <w:bCs/>
+        </w:rPr>
+        <w:t>llms</w:t>
+      </w:r>
+      <w:proofErr w:type="spellEnd"/>
     </w:p>
     <w:p>
       <w:pPr>
@@ -287,7 +329,15 @@
     </w:p>
     <w:p>
       <w:r>
-        <w:t>In this setup, the LLM agent observes its environment through text-based inputs and takes action using tools, like performing a web search. But how does it decide which action to take? This brings us to a crucial component of any LLM agent: planning. To plan effectively, the LLM needs to "reason" or "think" through a problem, often using techniques like Chain of Thought.</w:t>
+        <w:t xml:space="preserve">In this setup, the LLM agent observes its environment through text-based inputs and </w:t>
+      </w:r>
+      <w:proofErr w:type="gramStart"/>
+      <w:r>
+        <w:t>takes action</w:t>
+      </w:r>
+      <w:proofErr w:type="gramEnd"/>
+      <w:r>
+        <w:t xml:space="preserve"> using tools, like performing a web search. But how does it decide which action to take? This brings us to a crucial component of any LLM agent: planning. To plan effectively, the LLM needs to "reason" or "think" through a problem, often using techniques like Chain of Thought.</w:t>
       </w:r>
     </w:p>
     <w:p>
@@ -303,7 +353,15 @@
     <w:p>
       <w:r>
         <w:lastRenderedPageBreak/>
-        <w:t>Different systems can grant LLM agents varying degrees of freedom. Generally, the more "agentic" a system is, the more autonomy the LLM has in deciding its own behavior.</w:t>
+        <w:t xml:space="preserve">Different systems can grant LLM agents varying degrees of freedom. Generally, the more "agentic" a system is, the more autonomy the LLM has in deciding its own </w:t>
+      </w:r>
+      <w:proofErr w:type="spellStart"/>
+      <w:r>
+        <w:t>behavior</w:t>
+      </w:r>
+      <w:proofErr w:type="spellEnd"/>
+      <w:r>
+        <w:t>.</w:t>
       </w:r>
     </w:p>
     <w:p>
@@ -350,6 +408,86 @@
         </w:r>
       </w:hyperlink>
     </w:p>
+    <w:p/>
+    <w:p>
+      <w:pPr>
+        <w:rPr>
+          <w:b/>
+          <w:bCs/>
+        </w:rPr>
+      </w:pPr>
+      <w:proofErr w:type="gramStart"/>
+      <w:r>
+        <w:rPr>
+          <w:b/>
+          <w:bCs/>
+        </w:rPr>
+        <w:t>pre trained</w:t>
+      </w:r>
+      <w:proofErr w:type="gramEnd"/>
+      <w:r>
+        <w:rPr>
+          <w:b/>
+          <w:bCs/>
+        </w:rPr>
+        <w:t xml:space="preserve"> </w:t>
+      </w:r>
+      <w:proofErr w:type="gramStart"/>
+      <w:r>
+        <w:rPr>
+          <w:b/>
+          <w:bCs/>
+        </w:rPr>
+        <w:t>models</w:t>
+      </w:r>
+      <w:proofErr w:type="gramEnd"/>
+      <w:r>
+        <w:rPr>
+          <w:b/>
+          <w:bCs/>
+        </w:rPr>
+        <w:t xml:space="preserve"> </w:t>
+      </w:r>
+      <w:r>
+        <w:rPr>
+          <w:b/>
+          <w:bCs/>
+        </w:rPr>
+        <w:t>capabilities.</w:t>
+      </w:r>
+    </w:p>
+    <w:p>
+      <w:r>
+        <w:t>if</w:t>
+      </w:r>
+      <w:r>
+        <w:t xml:space="preserve"> </w:t>
+      </w:r>
+      <w:r>
+        <w:t xml:space="preserve">pre-trained LMs are large enough and prompted appropriately, they can </w:t>
+      </w:r>
+      <w:proofErr w:type="spellStart"/>
+      <w:r>
+        <w:t>effectivelydecompose</w:t>
+      </w:r>
+      <w:proofErr w:type="spellEnd"/>
+      <w:r>
+        <w:t xml:space="preserve"> high-level tasks into mid-level plans without any further training</w:t>
+      </w:r>
+    </w:p>
+    <w:p>
+      <w:hyperlink r:id="rId13" w:history="1">
+        <w:r>
+          <w:rPr>
+            <w:rStyle w:val="Hyperlink"/>
+          </w:rPr>
+          <w:t>arxiv.org/pdf/2201.07207</w:t>
+        </w:r>
+      </w:hyperlink>
+      <w:r>
+        <w:t>.</w:t>
+      </w:r>
+    </w:p>
     <w:p>
       <w:pPr>
         <w:rPr>
@@ -388,7 +526,15 @@
         <w:t>Example.log</w:t>
       </w:r>
       <w:r>
-        <w:t xml:space="preserve">   with issues in astar algo</w:t>
+        <w:t xml:space="preserve">   with issues in </w:t>
+      </w:r>
+      <w:proofErr w:type="spellStart"/>
+      <w:r>
+        <w:t>astar</w:t>
+      </w:r>
+      <w:proofErr w:type="spellEnd"/>
+      <w:r>
+        <w:t xml:space="preserve"> algo</w:t>
       </w:r>
     </w:p>
     <w:p>
@@ -450,7 +596,15 @@
         <w:t xml:space="preserve"> this one is </w:t>
       </w:r>
       <w:r>
-        <w:t>with fixed astar showed better accuracy.</w:t>
+        <w:t xml:space="preserve">with fixed </w:t>
+      </w:r>
+      <w:proofErr w:type="spellStart"/>
+      <w:r>
+        <w:t>astar</w:t>
+      </w:r>
+      <w:proofErr w:type="spellEnd"/>
+      <w:r>
+        <w:t xml:space="preserve"> showed better accuracy.</w:t>
       </w:r>
     </w:p>
     <w:p>
@@ -462,7 +616,15 @@
         </w:numPr>
       </w:pPr>
       <w:r>
-        <w:t>Added changes to the tool description to see the better functioning and returning json to the agent from tools</w:t>
+        <w:t xml:space="preserve">Added changes to the tool description to see the better functioning and returning </w:t>
+      </w:r>
+      <w:proofErr w:type="spellStart"/>
+      <w:r>
+        <w:t>json</w:t>
+      </w:r>
+      <w:proofErr w:type="spellEnd"/>
+      <w:r>
+        <w:t xml:space="preserve"> to the agent from tools</w:t>
       </w:r>
       <w:r>
         <w:t xml:space="preserve"> and tools in the system prompt</w:t>
@@ -503,8 +665,13 @@
       <w:r>
         <w:t xml:space="preserve">the following in the </w:t>
       </w:r>
-      <w:r>
-        <w:t xml:space="preserve">In prompt </w:t>
+      <w:proofErr w:type="gramStart"/>
+      <w:r>
+        <w:t>In</w:t>
+      </w:r>
+      <w:proofErr w:type="gramEnd"/>
+      <w:r>
+        <w:t xml:space="preserve"> prompt </w:t>
       </w:r>
       <w:r>
         <w:br/>
@@ -555,7 +722,15 @@
         <w:t>If the model finished the task successfully and with less step it means it does not follow the rules.</w:t>
       </w:r>
       <w:r>
-        <w:t xml:space="preserve"> Like step of 25 px.</w:t>
+        <w:t xml:space="preserve"> Like step of 25 </w:t>
+      </w:r>
+      <w:proofErr w:type="spellStart"/>
+      <w:r>
+        <w:t>px</w:t>
+      </w:r>
+      <w:proofErr w:type="spellEnd"/>
+      <w:r>
+        <w:t>.</w:t>
       </w:r>
     </w:p>
     <w:p/>
@@ -564,7 +739,76 @@
     <w:p>
       <w:pPr>
         <w:pStyle w:val="ListParagraph"/>
-      </w:pPr>
+        <w:rPr>
+          <w:b/>
+          <w:bCs/>
+        </w:rPr>
+      </w:pPr>
+      <w:r>
+        <w:rPr>
+          <w:b/>
+          <w:bCs/>
+        </w:rPr>
+        <w:lastRenderedPageBreak/>
+        <w:t>Models</w:t>
+      </w:r>
+      <w:r>
+        <w:rPr>
+          <w:b/>
+          <w:bCs/>
+        </w:rPr>
+        <w:t>:-</w:t>
+      </w:r>
+    </w:p>
+    <w:p>
+      <w:pPr>
+        <w:pStyle w:val="ListParagraph"/>
+      </w:pPr>
+      <w:r>
+        <w:t xml:space="preserve">Experimented with </w:t>
+      </w:r>
+      <w:proofErr w:type="spellStart"/>
+      <w:r>
+        <w:t>gpt-oss</w:t>
+      </w:r>
+      <w:proofErr w:type="spellEnd"/>
+      <w:r>
+        <w:t xml:space="preserve">  --- fast but inaccurate</w:t>
+      </w:r>
+    </w:p>
+    <w:p>
+      <w:pPr>
+        <w:pStyle w:val="ListParagraph"/>
+      </w:pPr>
+      <w:r>
+        <w:t xml:space="preserve">Gemma4 26b </w:t>
+      </w:r>
+      <w:proofErr w:type="spellStart"/>
+      <w:r>
+        <w:t>quantiazed</w:t>
+      </w:r>
+      <w:proofErr w:type="spellEnd"/>
+      <w:r>
+        <w:t xml:space="preserve"> --- slow and inaccurate</w:t>
+      </w:r>
+    </w:p>
+    <w:p>
+      <w:pPr>
+        <w:pStyle w:val="ListParagraph"/>
+      </w:pPr>
+      <w:r>
+        <w:t>Gemma 4 26b normal model ---accurate and fast</w:t>
+      </w:r>
+      <w:r>
+        <w:t xml:space="preserve"> </w:t>
+      </w:r>
+      <w:r>
+        <w:rPr>
+          <w:b/>
+          <w:bCs/>
+        </w:rPr>
+        <w:t>(BEST)</w:t>
+      </w:r>
     </w:p>
     <w:sectPr>
       <w:pgSz w:w="11906" w:h="16838"/>

</xml_diff>

<commit_message>
minor changes with testing gemma without astar
</commit_message>
<xml_diff>
--- a/project details/research_paper.docx
+++ b/project details/research_paper.docx
@@ -590,19 +590,108 @@
         <w:t xml:space="preserve"> after every tool call.</w:t>
       </w:r>
     </w:p>
+    <w:p>
+      <w:pPr>
+        <w:ind w:firstLine="360"/>
+        <w:rPr>
+          <w:b/>
+          <w:bCs/>
+        </w:rPr>
+      </w:pPr>
+      <w:r>
+        <w:rPr>
+          <w:b/>
+          <w:bCs/>
+        </w:rPr>
+        <w:t>example_react</w:t>
+      </w:r>
+      <w:r>
+        <w:rPr>
+          <w:b/>
+          <w:bCs/>
+        </w:rPr>
+        <w:t>.log</w:t>
+      </w:r>
+    </w:p>
+    <w:p>
+      <w:pPr>
+        <w:pStyle w:val="ListParagraph"/>
+        <w:numPr>
+          <w:ilvl w:val="0"/>
+          <w:numId w:val="2"/>
+        </w:numPr>
+      </w:pPr>
+      <w:r>
+        <w:t xml:space="preserve">Tested with gemma model  with astar it gives better </w:t>
+      </w:r>
+      <w:r>
+        <w:t>results th</w:t>
+      </w:r>
+      <w:r>
+        <w:t>at gpt-oss with good speed and less tokens</w:t>
+      </w:r>
+      <w:r>
+        <w:t xml:space="preserve"> </w:t>
+      </w:r>
+    </w:p>
+    <w:p>
+      <w:pPr>
+        <w:pStyle w:val="ListParagraph"/>
+        <w:rPr>
+          <w:b/>
+          <w:bCs/>
+        </w:rPr>
+      </w:pPr>
+      <w:r>
+        <w:rPr>
+          <w:b/>
+          <w:bCs/>
+        </w:rPr>
+        <w:t>Example_gemma.log</w:t>
+      </w:r>
+    </w:p>
+    <w:p>
+      <w:pPr>
+        <w:pStyle w:val="ListParagraph"/>
+        <w:numPr>
+          <w:ilvl w:val="0"/>
+          <w:numId w:val="2"/>
+        </w:numPr>
+      </w:pPr>
+      <w:r>
+        <w:t>Tested with gemma model  with</w:t>
+      </w:r>
+      <w:r>
+        <w:t>out</w:t>
+      </w:r>
+      <w:r>
+        <w:t xml:space="preserve"> astar it gives </w:t>
+      </w:r>
+      <w:r>
+        <w:t>bad results does not complete the task and hallusinates.</w:t>
+      </w:r>
+    </w:p>
+    <w:p>
+      <w:pPr>
+        <w:pStyle w:val="ListParagraph"/>
+      </w:pPr>
+    </w:p>
+    <w:p>
+      <w:r>
+        <w:t>Notes:-</w:t>
+      </w:r>
+    </w:p>
     <w:p/>
     <w:p>
       <w:r>
-        <w:t>Notes:-</w:t>
-      </w:r>
-    </w:p>
-    <w:p/>
-    <w:p>
-      <w:r>
+        <w:lastRenderedPageBreak/>
         <w:t>If the model finished the task successfully and with less step it means it does not follow the rules.</w:t>
       </w:r>
       <w:r>
         <w:t xml:space="preserve"> Like step of 25 px.</w:t>
+      </w:r>
+      <w:r>
+        <w:t xml:space="preserve"> For gpt-oss</w:t>
       </w:r>
     </w:p>
     <w:p/>
@@ -621,7 +710,6 @@
           <w:b/>
           <w:bCs/>
         </w:rPr>
-        <w:lastRenderedPageBreak/>
         <w:t>Models</w:t>
       </w:r>
       <w:r>
@@ -867,6 +955,24 @@
         </w:rPr>
         <w:t>Use pydantic.</w:t>
       </w:r>
+    </w:p>
+    <w:p>
+      <w:pPr>
+        <w:ind w:left="720"/>
+        <w:rPr>
+          <w:b/>
+          <w:bCs/>
+        </w:rPr>
+      </w:pPr>
+    </w:p>
+    <w:p>
+      <w:pPr>
+        <w:ind w:left="720"/>
+        <w:rPr>
+          <w:b/>
+          <w:bCs/>
+        </w:rPr>
+      </w:pPr>
     </w:p>
     <w:p/>
     <w:p/>

</xml_diff>

<commit_message>
fixed the goal completed issue and 5 crops working
</commit_message>
<xml_diff>
--- a/project details/research_paper.docx
+++ b/project details/research_paper.docx
@@ -9,12 +9,21 @@
           <w:bCs/>
         </w:rPr>
       </w:pPr>
-      <w:r>
-        <w:rPr>
-          <w:b/>
-          <w:bCs/>
-        </w:rPr>
-        <w:t>Llms latency</w:t>
+      <w:proofErr w:type="spellStart"/>
+      <w:r>
+        <w:rPr>
+          <w:b/>
+          <w:bCs/>
+        </w:rPr>
+        <w:t>Llms</w:t>
+      </w:r>
+      <w:proofErr w:type="spellEnd"/>
+      <w:r>
+        <w:rPr>
+          <w:b/>
+          <w:bCs/>
+        </w:rPr>
+        <w:t xml:space="preserve"> latency</w:t>
       </w:r>
     </w:p>
     <w:p>
@@ -106,7 +115,15 @@
         <w:t>Persistence</w:t>
       </w:r>
       <w:r>
-        <w:t>: Remembering past interactions to inform future behavior.</w:t>
+        <w:t xml:space="preserve">: Remembering past interactions to inform future </w:t>
+      </w:r>
+      <w:proofErr w:type="spellStart"/>
+      <w:r>
+        <w:t>behavior</w:t>
+      </w:r>
+      <w:proofErr w:type="spellEnd"/>
+      <w:r>
+        <w:t>.</w:t>
       </w:r>
     </w:p>
     <w:p/>
@@ -159,7 +176,23 @@
           <w:b/>
           <w:bCs/>
         </w:rPr>
-        <w:t>Non determinsistic nature</w:t>
+        <w:t xml:space="preserve">Non </w:t>
+      </w:r>
+      <w:proofErr w:type="spellStart"/>
+      <w:r>
+        <w:rPr>
+          <w:b/>
+          <w:bCs/>
+        </w:rPr>
+        <w:t>determinsistic</w:t>
+      </w:r>
+      <w:proofErr w:type="spellEnd"/>
+      <w:r>
+        <w:rPr>
+          <w:b/>
+          <w:bCs/>
+        </w:rPr>
+        <w:t xml:space="preserve"> nature</w:t>
       </w:r>
     </w:p>
     <w:p>
@@ -212,8 +245,17 @@
           <w:b/>
           <w:bCs/>
         </w:rPr>
-        <w:t>text based limitation of llms</w:t>
-      </w:r>
+        <w:t xml:space="preserve">text based limitation of </w:t>
+      </w:r>
+      <w:proofErr w:type="spellStart"/>
+      <w:r>
+        <w:rPr>
+          <w:b/>
+          <w:bCs/>
+        </w:rPr>
+        <w:t>llms</w:t>
+      </w:r>
+      <w:proofErr w:type="spellEnd"/>
     </w:p>
     <w:p>
       <w:pPr>
@@ -287,7 +329,15 @@
     </w:p>
     <w:p>
       <w:r>
-        <w:t>In this setup, the LLM agent observes its environment through text-based inputs and takes action using tools, like performing a web search. But how does it decide which action to take? This brings us to a crucial component of any LLM agent: planning. To plan effectively, the LLM needs to "reason" or "think" through a problem, often using techniques like Chain of Thought.</w:t>
+        <w:t xml:space="preserve">In this setup, the LLM agent observes its environment through text-based inputs and </w:t>
+      </w:r>
+      <w:proofErr w:type="gramStart"/>
+      <w:r>
+        <w:t>takes action</w:t>
+      </w:r>
+      <w:proofErr w:type="gramEnd"/>
+      <w:r>
+        <w:t xml:space="preserve"> using tools, like performing a web search. But how does it decide which action to take? This brings us to a crucial component of any LLM agent: planning. To plan effectively, the LLM needs to "reason" or "think" through a problem, often using techniques like Chain of Thought.</w:t>
       </w:r>
     </w:p>
     <w:p>
@@ -303,7 +353,15 @@
     <w:p>
       <w:r>
         <w:lastRenderedPageBreak/>
-        <w:t>Different systems can grant LLM agents varying degrees of freedom. Generally, the more "agentic" a system is, the more autonomy the LLM has in deciding its own behavior.</w:t>
+        <w:t xml:space="preserve">Different systems can grant LLM agents varying degrees of freedom. Generally, the more "agentic" a system is, the more autonomy the LLM has in deciding its own </w:t>
+      </w:r>
+      <w:proofErr w:type="spellStart"/>
+      <w:r>
+        <w:t>behavior</w:t>
+      </w:r>
+      <w:proofErr w:type="spellEnd"/>
+      <w:r>
+        <w:t>.</w:t>
       </w:r>
     </w:p>
     <w:p>
@@ -358,12 +416,37 @@
           <w:bCs/>
         </w:rPr>
       </w:pPr>
-      <w:r>
-        <w:rPr>
-          <w:b/>
-          <w:bCs/>
-        </w:rPr>
-        <w:t xml:space="preserve">pre trained models </w:t>
+      <w:proofErr w:type="gramStart"/>
+      <w:r>
+        <w:rPr>
+          <w:b/>
+          <w:bCs/>
+        </w:rPr>
+        <w:t>pre trained</w:t>
+      </w:r>
+      <w:proofErr w:type="gramEnd"/>
+      <w:r>
+        <w:rPr>
+          <w:b/>
+          <w:bCs/>
+        </w:rPr>
+        <w:t xml:space="preserve"> </w:t>
+      </w:r>
+      <w:proofErr w:type="gramStart"/>
+      <w:r>
+        <w:rPr>
+          <w:b/>
+          <w:bCs/>
+        </w:rPr>
+        <w:t>models</w:t>
+      </w:r>
+      <w:proofErr w:type="gramEnd"/>
+      <w:r>
+        <w:rPr>
+          <w:b/>
+          <w:bCs/>
+        </w:rPr>
+        <w:t xml:space="preserve"> </w:t>
       </w:r>
       <w:r>
         <w:rPr>
@@ -381,7 +464,15 @@
         <w:t xml:space="preserve"> </w:t>
       </w:r>
       <w:r>
-        <w:t>pre-trained LMs are large enough and prompted appropriately, they can effectivelydecompose high-level tasks into mid-level plans without any further training</w:t>
+        <w:t xml:space="preserve">pre-trained LMs are large enough and prompted appropriately, they can </w:t>
+      </w:r>
+      <w:proofErr w:type="spellStart"/>
+      <w:r>
+        <w:t>effectivelydecompose</w:t>
+      </w:r>
+      <w:proofErr w:type="spellEnd"/>
+      <w:r>
+        <w:t xml:space="preserve"> high-level tasks into mid-level plans without any further training</w:t>
       </w:r>
     </w:p>
     <w:p>
@@ -435,7 +526,15 @@
         <w:t>Example.log</w:t>
       </w:r>
       <w:r>
-        <w:t xml:space="preserve">   with issues in astar algo</w:t>
+        <w:t xml:space="preserve">   with issues in </w:t>
+      </w:r>
+      <w:proofErr w:type="spellStart"/>
+      <w:r>
+        <w:t>astar</w:t>
+      </w:r>
+      <w:proofErr w:type="spellEnd"/>
+      <w:r>
+        <w:t xml:space="preserve"> algo</w:t>
       </w:r>
     </w:p>
     <w:p>
@@ -497,7 +596,15 @@
         <w:t xml:space="preserve"> this one is </w:t>
       </w:r>
       <w:r>
-        <w:t>with fixed astar showed better accuracy.</w:t>
+        <w:t xml:space="preserve">with fixed </w:t>
+      </w:r>
+      <w:proofErr w:type="spellStart"/>
+      <w:r>
+        <w:t>astar</w:t>
+      </w:r>
+      <w:proofErr w:type="spellEnd"/>
+      <w:r>
+        <w:t xml:space="preserve"> showed better accuracy.</w:t>
       </w:r>
     </w:p>
     <w:p>
@@ -509,7 +616,15 @@
         </w:numPr>
       </w:pPr>
       <w:r>
-        <w:t>Added changes to the tool description to see the better functioning and returning json to the agent from tools</w:t>
+        <w:t xml:space="preserve">Added changes to the tool description to see the better functioning and returning </w:t>
+      </w:r>
+      <w:proofErr w:type="spellStart"/>
+      <w:r>
+        <w:t>json</w:t>
+      </w:r>
+      <w:proofErr w:type="spellEnd"/>
+      <w:r>
+        <w:t xml:space="preserve"> to the agent from tools</w:t>
       </w:r>
       <w:r>
         <w:t xml:space="preserve"> and tools in the system prompt</w:t>
@@ -550,8 +665,13 @@
       <w:r>
         <w:t xml:space="preserve">the following in the </w:t>
       </w:r>
-      <w:r>
-        <w:t xml:space="preserve">In prompt </w:t>
+      <w:proofErr w:type="gramStart"/>
+      <w:r>
+        <w:t>In</w:t>
+      </w:r>
+      <w:proofErr w:type="gramEnd"/>
+      <w:r>
+        <w:t xml:space="preserve"> prompt </w:t>
       </w:r>
       <w:r>
         <w:br/>
@@ -622,13 +742,29 @@
         </w:numPr>
       </w:pPr>
       <w:r>
-        <w:t xml:space="preserve">Tested with gemma model  with astar it gives better </w:t>
+        <w:t xml:space="preserve">Tested with gemma model  with </w:t>
+      </w:r>
+      <w:proofErr w:type="spellStart"/>
+      <w:r>
+        <w:t>astar</w:t>
+      </w:r>
+      <w:proofErr w:type="spellEnd"/>
+      <w:r>
+        <w:t xml:space="preserve"> it gives better </w:t>
       </w:r>
       <w:r>
         <w:t>results th</w:t>
       </w:r>
       <w:r>
-        <w:t>at gpt-oss with good speed and less tokens</w:t>
+        <w:t xml:space="preserve">at </w:t>
+      </w:r>
+      <w:proofErr w:type="spellStart"/>
+      <w:r>
+        <w:t>gpt-oss</w:t>
+      </w:r>
+      <w:proofErr w:type="spellEnd"/>
+      <w:r>
+        <w:t xml:space="preserve"> with good speed and less tokens</w:t>
       </w:r>
       <w:r>
         <w:t xml:space="preserve"> </w:t>
@@ -665,10 +801,26 @@
         <w:t>out</w:t>
       </w:r>
       <w:r>
-        <w:t xml:space="preserve"> astar it gives </w:t>
-      </w:r>
-      <w:r>
-        <w:t>bad results does not complete the task and hallusinates.</w:t>
+        <w:t xml:space="preserve"> </w:t>
+      </w:r>
+      <w:proofErr w:type="spellStart"/>
+      <w:r>
+        <w:t>astar</w:t>
+      </w:r>
+      <w:proofErr w:type="spellEnd"/>
+      <w:r>
+        <w:t xml:space="preserve"> it gives </w:t>
+      </w:r>
+      <w:r>
+        <w:t xml:space="preserve">bad results does not complete the task and </w:t>
+      </w:r>
+      <w:proofErr w:type="spellStart"/>
+      <w:r>
+        <w:t>hallusinates</w:t>
+      </w:r>
+      <w:proofErr w:type="spellEnd"/>
+      <w:r>
+        <w:t>.</w:t>
       </w:r>
     </w:p>
     <w:p>
@@ -688,11 +840,24 @@
         <w:t>If the model finished the task successfully and with less step it means it does not follow the rules.</w:t>
       </w:r>
       <w:r>
-        <w:t xml:space="preserve"> Like step of 25 px.</w:t>
-      </w:r>
-      <w:r>
-        <w:t xml:space="preserve"> For gpt-oss</w:t>
-      </w:r>
+        <w:t xml:space="preserve"> Like step of 25 </w:t>
+      </w:r>
+      <w:proofErr w:type="spellStart"/>
+      <w:r>
+        <w:t>px</w:t>
+      </w:r>
+      <w:proofErr w:type="spellEnd"/>
+      <w:r>
+        <w:t>.</w:t>
+      </w:r>
+      <w:r>
+        <w:t xml:space="preserve"> For </w:t>
+      </w:r>
+      <w:proofErr w:type="spellStart"/>
+      <w:r>
+        <w:t>gpt-oss</w:t>
+      </w:r>
+      <w:proofErr w:type="spellEnd"/>
     </w:p>
     <w:p/>
     <w:p/>
@@ -725,7 +890,15 @@
         <w:pStyle w:val="ListParagraph"/>
       </w:pPr>
       <w:r>
-        <w:t>Experimented with gpt-oss  --- fast but inaccurate</w:t>
+        <w:t xml:space="preserve">Experimented with </w:t>
+      </w:r>
+      <w:proofErr w:type="spellStart"/>
+      <w:r>
+        <w:t>gpt-oss</w:t>
+      </w:r>
+      <w:proofErr w:type="spellEnd"/>
+      <w:r>
+        <w:t xml:space="preserve">  --- fast but inaccurate</w:t>
       </w:r>
     </w:p>
     <w:p>
@@ -733,7 +906,15 @@
         <w:pStyle w:val="ListParagraph"/>
       </w:pPr>
       <w:r>
-        <w:t>Gemma4 26b quantiazed --- slow and inaccurate</w:t>
+        <w:t xml:space="preserve">Gemma4 26b </w:t>
+      </w:r>
+      <w:proofErr w:type="spellStart"/>
+      <w:r>
+        <w:t>quantiazed</w:t>
+      </w:r>
+      <w:proofErr w:type="spellEnd"/>
+      <w:r>
+        <w:t xml:space="preserve"> --- slow and inaccurate</w:t>
       </w:r>
     </w:p>
     <w:p>
@@ -932,12 +1113,37 @@
           <w:bCs/>
         </w:rPr>
       </w:pPr>
-      <w:r>
-        <w:rPr>
-          <w:b/>
-          <w:bCs/>
-        </w:rPr>
-        <w:t>Some times it returns dict instead of string.</w:t>
+      <w:proofErr w:type="gramStart"/>
+      <w:r>
+        <w:rPr>
+          <w:b/>
+          <w:bCs/>
+        </w:rPr>
+        <w:t>Some times</w:t>
+      </w:r>
+      <w:proofErr w:type="gramEnd"/>
+      <w:r>
+        <w:rPr>
+          <w:b/>
+          <w:bCs/>
+        </w:rPr>
+        <w:t xml:space="preserve"> it returns </w:t>
+      </w:r>
+      <w:proofErr w:type="spellStart"/>
+      <w:r>
+        <w:rPr>
+          <w:b/>
+          <w:bCs/>
+        </w:rPr>
+        <w:t>dict</w:t>
+      </w:r>
+      <w:proofErr w:type="spellEnd"/>
+      <w:r>
+        <w:rPr>
+          <w:b/>
+          <w:bCs/>
+        </w:rPr>
+        <w:t xml:space="preserve"> instead of string.</w:t>
       </w:r>
     </w:p>
     <w:p>
@@ -953,16 +1159,28 @@
           <w:b/>
           <w:bCs/>
         </w:rPr>
-        <w:t>Use pydantic.</w:t>
+        <w:t xml:space="preserve">Use </w:t>
+      </w:r>
+      <w:proofErr w:type="spellStart"/>
+      <w:r>
+        <w:rPr>
+          <w:b/>
+          <w:bCs/>
+        </w:rPr>
+        <w:t>pydantic</w:t>
+      </w:r>
+      <w:proofErr w:type="spellEnd"/>
+      <w:r>
+        <w:rPr>
+          <w:b/>
+          <w:bCs/>
+        </w:rPr>
+        <w:t>.</w:t>
       </w:r>
     </w:p>
     <w:p>
       <w:pPr>
         <w:ind w:left="720"/>
-        <w:rPr>
-          <w:b/>
-          <w:bCs/>
-        </w:rPr>
       </w:pPr>
       <w:r>
         <w:rPr>
@@ -977,7 +1195,62 @@
           <w:bCs/>
         </w:rPr>
         <w:br/>
-        <w:t>implemented pydantic</w:t>
+      </w:r>
+      <w:r>
+        <w:t xml:space="preserve">implemented </w:t>
+      </w:r>
+      <w:proofErr w:type="spellStart"/>
+      <w:r>
+        <w:t>pydantic</w:t>
+      </w:r>
+      <w:proofErr w:type="spellEnd"/>
+    </w:p>
+    <w:p>
+      <w:pPr>
+        <w:ind w:left="720"/>
+        <w:rPr>
+          <w:b/>
+          <w:bCs/>
+        </w:rPr>
+      </w:pPr>
+      <w:r>
+        <w:rPr>
+          <w:b/>
+          <w:bCs/>
+        </w:rPr>
+        <w:t>Tested with multiple crops.</w:t>
+      </w:r>
+    </w:p>
+    <w:p>
+      <w:pPr>
+        <w:ind w:left="720"/>
+        <w:rPr>
+          <w:b/>
+          <w:bCs/>
+        </w:rPr>
+      </w:pPr>
+      <w:r>
+        <w:rPr>
+          <w:b/>
+          <w:bCs/>
+        </w:rPr>
+        <w:t xml:space="preserve">Next </w:t>
+      </w:r>
+      <w:proofErr w:type="spellStart"/>
+      <w:r>
+        <w:rPr>
+          <w:b/>
+          <w:bCs/>
+        </w:rPr>
+        <w:t>qwen</w:t>
+      </w:r>
+      <w:proofErr w:type="spellEnd"/>
+      <w:r>
+        <w:rPr>
+          <w:b/>
+          <w:bCs/>
+        </w:rPr>
+        <w:t xml:space="preserve"> model</w:t>
       </w:r>
     </w:p>
     <w:p>

</xml_diff>

<commit_message>
added the new notes
</commit_message>
<xml_diff>
--- a/project details/research_paper.docx
+++ b/project details/research_paper.docx
@@ -318,16 +318,7 @@
     </w:p>
     <w:p>
       <w:r>
-        <w:t>R</w:t>
-      </w:r>
-      <w:r>
-        <w:t>easoning</w:t>
-      </w:r>
-      <w:r>
-        <w:t xml:space="preserve"> </w:t>
-      </w:r>
-      <w:r>
-        <w:t>traces help the model induce, track, and update action plans as well as handle</w:t>
+        <w:t>Reasoning traces help the model induce, track, and update action plans as well as handle</w:t>
       </w:r>
     </w:p>
     <w:p>
@@ -375,13 +366,7 @@
     </w:p>
     <w:p>
       <w:r>
-        <w:t>if</w:t>
-      </w:r>
-      <w:r>
-        <w:t xml:space="preserve"> </w:t>
-      </w:r>
-      <w:r>
-        <w:t>pre-trained LMs are large enough and prompted appropriately, they can effectivelydecompose high-level tasks into mid-level plans without any further training</w:t>
+        <w:t>if pre-trained LMs are large enough and prompted appropriately, they can effectivelydecompose high-level tasks into mid-level plans without any further training</w:t>
       </w:r>
     </w:p>
     <w:p>
@@ -409,6 +394,86 @@
           <w:b/>
           <w:bCs/>
         </w:rPr>
+        <w:t>world models</w:t>
+      </w:r>
+    </w:p>
+    <w:p>
+      <w:r>
+        <w:t>we feed the correct walkthrough to ChatGPT and test whether it can learn the world</w:t>
+      </w:r>
+    </w:p>
+    <w:p>
+      <w:r>
+        <w:t>model of Zork by reading the walkthrough. This is important because world models are widely</w:t>
+      </w:r>
+    </w:p>
+    <w:p>
+      <w:r>
+        <w:t>believed to be a key building block of the road towards human-level intelligence (Ha &amp; Schmidhuber,</w:t>
+      </w:r>
+    </w:p>
+    <w:p>
+      <w:r>
+        <w:t>2018; Matsuo et al., 2022)</w:t>
+      </w:r>
+    </w:p>
+    <w:p>
+      <w:hyperlink r:id="rId14" w:history="1">
+        <w:r>
+          <w:rPr>
+            <w:rStyle w:val="Hyperlink"/>
+          </w:rPr>
+          <w:t>arxiv.org/pdf/2304.02868</w:t>
+        </w:r>
+      </w:hyperlink>
+    </w:p>
+    <w:p>
+      <w:pPr>
+        <w:rPr>
+          <w:b/>
+          <w:bCs/>
+        </w:rPr>
+      </w:pPr>
+      <w:r>
+        <w:rPr>
+          <w:b/>
+          <w:bCs/>
+        </w:rPr>
+        <w:t>slam testing</w:t>
+      </w:r>
+    </w:p>
+    <w:p>
+      <w:r>
+        <w:t>evaluates the ability of ChatGPT to perform simultaneous localiza-</w:t>
+      </w:r>
+    </w:p>
+    <w:p>
+      <w:r>
+        <w:t>tion and mapping (SLAM). Ideally, an intelligent agent will be able to construct a map while it is</w:t>
+      </w:r>
+    </w:p>
+    <w:p>
+      <w:r>
+        <w:t>navigating through a new environment so that it is always aware of where it is as well as how it could</w:t>
+      </w:r>
+    </w:p>
+    <w:p>
+      <w:r>
+        <w:t>reach a given destination (Thrun et al., 2005)</w:t>
+      </w:r>
+    </w:p>
+    <w:p>
+      <w:pPr>
+        <w:rPr>
+          <w:b/>
+          <w:bCs/>
+        </w:rPr>
+      </w:pPr>
+      <w:r>
+        <w:rPr>
+          <w:b/>
+          <w:bCs/>
+        </w:rPr>
         <w:t>Experime</w:t>
       </w:r>
       <w:r>
@@ -545,18 +610,14 @@
         </w:numPr>
       </w:pPr>
       <w:r>
+        <w:lastRenderedPageBreak/>
         <w:t xml:space="preserve">For ``` error added </w:t>
       </w:r>
       <w:r>
-        <w:t xml:space="preserve">the following in the </w:t>
-      </w:r>
-      <w:r>
-        <w:t xml:space="preserve">In prompt </w:t>
+        <w:t xml:space="preserve">the following in the In prompt </w:t>
       </w:r>
       <w:r>
         <w:br/>
-      </w:r>
-      <w:r>
         <w:t>Never output tool arguments as text, JSON, markdown, or code blocks.</w:t>
       </w:r>
     </w:p>
@@ -603,14 +664,7 @@
           <w:b/>
           <w:bCs/>
         </w:rPr>
-        <w:t>example_react</w:t>
-      </w:r>
-      <w:r>
-        <w:rPr>
-          <w:b/>
-          <w:bCs/>
-        </w:rPr>
-        <w:t>.log</w:t>
+        <w:t>example_react.log</w:t>
       </w:r>
     </w:p>
     <w:p>
@@ -684,7 +738,6 @@
     <w:p/>
     <w:p>
       <w:r>
-        <w:lastRenderedPageBreak/>
         <w:t>If the model finished the task successfully and with less step it means it does not follow the rules.</w:t>
       </w:r>
       <w:r>
@@ -761,11 +814,10 @@
     <w:p>
       <w:pPr>
         <w:pStyle w:val="ListParagraph"/>
-        <w:rPr>
-          <w:b/>
-          <w:bCs/>
-        </w:rPr>
-      </w:pPr>
+      </w:pPr>
+      <w:r>
+        <w:t>qwen3.5:27b  model is very slow response time: 112.374789687</w:t>
+      </w:r>
     </w:p>
     <w:p>
       <w:pPr>
@@ -775,7 +827,16 @@
           <w:bCs/>
         </w:rPr>
       </w:pPr>
-      <w:hyperlink r:id="rId14" w:history="1">
+    </w:p>
+    <w:p>
+      <w:pPr>
+        <w:pStyle w:val="ListParagraph"/>
+        <w:rPr>
+          <w:b/>
+          <w:bCs/>
+        </w:rPr>
+      </w:pPr>
+      <w:hyperlink r:id="rId15" w:history="1">
         <w:r>
           <w:rPr>
             <w:rStyle w:val="Hyperlink"/>
@@ -792,7 +853,7 @@
         </w:rPr>
         <w:t>, </w:t>
       </w:r>
-      <w:hyperlink r:id="rId15" w:history="1">
+      <w:hyperlink r:id="rId16" w:history="1">
         <w:r>
           <w:rPr>
             <w:rStyle w:val="Hyperlink"/>
@@ -823,7 +884,7 @@
         </w:rPr>
         <w:t>or </w:t>
       </w:r>
-      <w:hyperlink r:id="rId16" w:history="1">
+      <w:hyperlink r:id="rId17" w:history="1">
         <w:r>
           <w:rPr>
             <w:rStyle w:val="Hyperlink"/>
@@ -937,7 +998,14 @@
           <w:b/>
           <w:bCs/>
         </w:rPr>
-        <w:t>Some times it returns dict instead of string.</w:t>
+        <w:t>Sometimes</w:t>
+      </w:r>
+      <w:r>
+        <w:rPr>
+          <w:b/>
+          <w:bCs/>
+        </w:rPr>
+        <w:t xml:space="preserve"> it returns dict instead of string.</w:t>
       </w:r>
     </w:p>
     <w:p>
@@ -959,10 +1027,6 @@
     <w:p>
       <w:pPr>
         <w:ind w:left="720"/>
-        <w:rPr>
-          <w:b/>
-          <w:bCs/>
-        </w:rPr>
       </w:pPr>
       <w:r>
         <w:rPr>
@@ -977,6 +1041,8 @@
           <w:bCs/>
         </w:rPr>
         <w:br/>
+      </w:r>
+      <w:r>
         <w:t>implemented pydantic</w:t>
       </w:r>
     </w:p>
@@ -988,7 +1054,164 @@
           <w:bCs/>
         </w:rPr>
       </w:pPr>
-    </w:p>
+      <w:r>
+        <w:rPr>
+          <w:b/>
+          <w:bCs/>
+        </w:rPr>
+        <w:lastRenderedPageBreak/>
+        <w:t>Tested with multiple crops.</w:t>
+      </w:r>
+    </w:p>
+    <w:p>
+      <w:pPr>
+        <w:ind w:left="720"/>
+        <w:rPr>
+          <w:b/>
+          <w:bCs/>
+        </w:rPr>
+      </w:pPr>
+    </w:p>
+    <w:p>
+      <w:pPr>
+        <w:ind w:left="720"/>
+        <w:rPr>
+          <w:b/>
+          <w:bCs/>
+        </w:rPr>
+      </w:pPr>
+    </w:p>
+    <w:p>
+      <w:pPr>
+        <w:ind w:left="720"/>
+        <w:rPr>
+          <w:b/>
+          <w:bCs/>
+        </w:rPr>
+      </w:pPr>
+      <w:r>
+        <w:rPr>
+          <w:b/>
+          <w:bCs/>
+        </w:rPr>
+        <w:t>Non-trival inputs</w:t>
+      </w:r>
+    </w:p>
+    <w:p>
+      <w:pPr>
+        <w:ind w:left="720"/>
+      </w:pPr>
+      <w:r>
+        <w:t>Do whatever is necessary to begin growing crops on the farm.</w:t>
+      </w:r>
+    </w:p>
+    <w:p>
+      <w:pPr>
+        <w:ind w:left="720"/>
+      </w:pPr>
+    </w:p>
+    <w:p>
+      <w:pPr>
+        <w:ind w:left="720"/>
+        <w:rPr>
+          <w:b/>
+          <w:bCs/>
+        </w:rPr>
+      </w:pPr>
+      <w:r>
+        <w:rPr>
+          <w:b/>
+          <w:bCs/>
+        </w:rPr>
+        <w:t>Speech from user</w:t>
+      </w:r>
+    </w:p>
+    <w:p>
+      <w:pPr>
+        <w:rPr>
+          <w:b/>
+          <w:bCs/>
+        </w:rPr>
+      </w:pPr>
+      <w:r>
+        <w:rPr>
+          <w:b/>
+          <w:bCs/>
+        </w:rPr>
+        <w:tab/>
+      </w:r>
+      <w:hyperlink r:id="rId18" w:history="1">
+        <w:r>
+          <w:rPr>
+            <w:rStyle w:val="Hyperlink"/>
+            <w:b/>
+            <w:bCs/>
+          </w:rPr>
+          <w:t>speech_recognition/examples/microphone_recognition.py at master · Uberi/speech_recognition</w:t>
+        </w:r>
+      </w:hyperlink>
+    </w:p>
+    <w:p>
+      <w:pPr>
+        <w:rPr>
+          <w:b/>
+          <w:bCs/>
+        </w:rPr>
+      </w:pPr>
+    </w:p>
+    <w:p>
+      <w:pPr>
+        <w:rPr>
+          <w:b/>
+          <w:bCs/>
+        </w:rPr>
+      </w:pPr>
+      <w:r>
+        <w:rPr>
+          <w:b/>
+          <w:bCs/>
+        </w:rPr>
+        <w:t>used r.recognize but the results are not good</w:t>
+      </w:r>
+      <w:r>
+        <w:rPr>
+          <w:b/>
+          <w:bCs/>
+        </w:rPr>
+        <w:t xml:space="preserve"> for </w:t>
+      </w:r>
+      <w:r>
+        <w:rPr>
+          <w:b/>
+          <w:bCs/>
+        </w:rPr>
+        <w:t>speech to audio file.</w:t>
+      </w:r>
+    </w:p>
+    <w:p>
+      <w:pPr>
+        <w:rPr>
+          <w:b/>
+          <w:bCs/>
+        </w:rPr>
+      </w:pPr>
+      <w:r>
+        <w:rPr>
+          <w:b/>
+          <w:bCs/>
+        </w:rPr>
+        <w:t>Used whisper server api. And the time for audio processing is directly propostion to the length of the input.</w:t>
+      </w:r>
+    </w:p>
+    <w:p>
+      <w:pPr>
+        <w:rPr>
+          <w:b/>
+          <w:bCs/>
+        </w:rPr>
+      </w:pPr>
+    </w:p>
+    <w:p/>
     <w:p/>
     <w:p/>
     <w:sectPr>
@@ -2750,6 +2973,19 @@
       <w:u w:val="single"/>
     </w:rPr>
   </w:style>
+  <w:style w:type="paragraph" w:styleId="NormalWeb">
+    <w:name w:val="Normal (Web)"/>
+    <w:basedOn w:val="Normal"/>
+    <w:uiPriority w:val="99"/>
+    <w:semiHidden/>
+    <w:unhideWhenUsed/>
+    <w:rsid w:val="00C42E2C"/>
+    <w:rPr>
+      <w:rFonts w:ascii="Times New Roman" w:hAnsi="Times New Roman" w:cs="Times New Roman"/>
+      <w:sz w:val="24"/>
+      <w:szCs w:val="24"/>
+    </w:rPr>
+  </w:style>
 </w:styles>
 </file>
 

</xml_diff>